<commit_message>
Deploy PSYCH 350 RC37 protected-ta-guide 2026-09-03
</commit_message>
<xml_diff>
--- a/lab-materials/final-project/interpersonal_survey_materials/inter-preproposal.docx
+++ b/lab-materials/final-project/interpersonal_survey_materials/inter-preproposal.docx
@@ -4970,7 +4970,9 @@
               <wp:extent cx="847991" cy="0"/>
               <wp:effectExtent l="0" t="12700" r="28575" b="25400"/>
               <wp:wrapNone/>
-              <wp:docPr id="1138935457" name="Straight Connector 1"/>
+              <wp:docPr id="1138935457" name="Straight Connector 1">
+                <ns0:decorative xmlns:ns0="http://schemas.microsoft.com/office/drawing/2017/decorative" val="1"/>
+              </wp:docPr>
               <wp:cNvGraphicFramePr/>
               <a:graphic xmlns:a="http://schemas.openxmlformats.org/drawingml/2006/main">
                 <a:graphicData uri="http://schemas.microsoft.com/office/word/2010/wordprocessingShape">
@@ -5040,7 +5042,9 @@
               <wp:extent cx="7010400" cy="0"/>
               <wp:effectExtent l="0" t="12700" r="25400" b="25400"/>
               <wp:wrapNone/>
-              <wp:docPr id="1705665425" name="Straight Connector 1"/>
+              <wp:docPr id="1705665425" name="Straight Connector 1">
+                <ns1:decorative xmlns:ns1="http://schemas.microsoft.com/office/drawing/2017/decorative" val="1"/>
+              </wp:docPr>
               <wp:cNvGraphicFramePr/>
               <a:graphic xmlns:a="http://schemas.openxmlformats.org/drawingml/2006/main">
                 <a:graphicData uri="http://schemas.microsoft.com/office/word/2010/wordprocessingShape">
@@ -5197,7 +5201,9 @@
               <wp:extent cx="437050" cy="0"/>
               <wp:effectExtent l="0" t="12700" r="33020" b="25400"/>
               <wp:wrapNone/>
-              <wp:docPr id="160056721" name="Straight Connector 1"/>
+              <wp:docPr id="160056721" name="Straight Connector 1">
+                <adec:decorative val="1"/>
+              </wp:docPr>
               <wp:cNvGraphicFramePr/>
               <a:graphic xmlns:a="http://schemas.openxmlformats.org/drawingml/2006/main">
                 <a:graphicData uri="http://schemas.microsoft.com/office/word/2010/wordprocessingShape">
@@ -5261,7 +5267,9 @@
               <wp:extent cx="7010400" cy="0"/>
               <wp:effectExtent l="0" t="12700" r="25400" b="25400"/>
               <wp:wrapNone/>
-              <wp:docPr id="1347243333" name="Straight Connector 1"/>
+              <wp:docPr id="1347243333" name="Straight Connector 1">
+                <adec:decorative val="1"/>
+              </wp:docPr>
               <wp:cNvGraphicFramePr/>
               <a:graphic xmlns:a="http://schemas.openxmlformats.org/drawingml/2006/main">
                 <a:graphicData uri="http://schemas.microsoft.com/office/word/2010/wordprocessingShape">
@@ -11123,6 +11131,22 @@
       <w:sz w:val="28"/>
     </w:rPr>
   </w:style>
+  <w:style w:customStyle="1" w:styleId="Question" w:type="paragraph">
+    <w:name w:val="Question"/>
+    <w:basedOn w:val="Normal"/>
+    <w:next w:val="Normal"/>
+    <w:pPr>
+      <w:numPr>
+        <w:ilvl w:val="4"/>
+        <w:numId w:val="42"/>
+      </w:numPr>
+      <w:spacing w:after="40" w:before="80"/>
+    </w:pPr>
+    <w:rPr>
+      <w:color w:themeColor="text1" w:val="000000"/>
+      <w:sz w:val="28"/>
+    </w:rPr>
+  </w:style>
   <w:style w:styleId="Heading6" w:type="paragraph">
     <w:name w:val="heading 6"/>
     <w:basedOn w:val="Normal"/>

</xml_diff>